<commit_message>
feat: add 20 minimalist service specification posters with direct consultation routing
</commit_message>
<xml_diff>
--- a/public/chat_files/cruz_bio_and_outreach_final.docx
+++ b/public/chat_files/cruz_bio_and_outreach_final.docx
@@ -40,7 +40,7 @@
         <w:rPr>
           <w:sz w:val="22"/>
         </w:rPr>
-        <w:t xml:space="preserve">EMAIL 3 — Subject: Flat metro pallet rates + 2hr free dock time</w:t>
+        <w:t xml:space="preserve">EMAIL 3 — Subject: Flat metro rates (Effective Nov 1, 2026)</w:t>
       </w:r>
     </w:p>
     <w:p>
@@ -48,7 +48,15 @@
         <w:rPr>
           <w:sz w:val="22"/>
         </w:rPr>
-        <w:t xml:space="preserve">All three templates formatted with merge tags and short mobile-friendly subject lines.</w:t>
+        <w:t xml:space="preserve">Rates effective November 1, 2026. Includes 2-hour free dock window and flat metro zone pricing within 40 miles.</w:t>
+      </w:r>
+    </w:p>
+    <w:p>
+      <w:r>
+        <w:rPr>
+          <w:sz w:val="22"/>
+        </w:rPr>
+        <w:t xml:space="preserve">Templates formatted with short mobile-friendly subject lines and clear dispatcher contact info.</w:t>
       </w:r>
     </w:p>
   </w:body>

</xml_diff>